<commit_message>
feat(paid-ads): 0-count option for Recently launched (omit section)
- NumberPicker for recent ads now offers 0 / 3 / 5 / 10 / 15 / 20.
  When 0 is selected, the Rank by + Launched since controls grey out.
- Backend passes show_recent: recent_n > 0 to docxtemplater.
- Template wraps the entire Recently launched section (heading +
  description + table) in {#show_recent}...{/show_recent} so the
  block is removed cleanly from the generated .docx when count is 0.
  Used paragraphLoop:true marker paragraphs so no empty paragraphs
  remain after render.
</commit_message>
<xml_diff>
--- a/src/templates/weekly-report.docx
+++ b/src/templates/weekly-report.docx
@@ -806,6 +806,11 @@
       </w:tr>
     </w:tbl>
     <w:p>
+      <w:r>
+        <w:t xml:space="preserve">{#show_recent}</w:t>
+      </w:r>
+    </w:p>
+    <w:p>
       <w:pPr>
         <w:pBdr>
           <w:bottom w:color="ed1c24" w:space="4" w:sz="6" w:val="single"/>
@@ -1330,6 +1335,11 @@
         </w:tc>
       </w:tr>
     </w:tbl>
+    <w:p>
+      <w:r>
+        <w:t xml:space="preserve">{/show_recent}</w:t>
+      </w:r>
+    </w:p>
     <w:p>
       <w:pPr>
         <w:pBdr>

</xml_diff>

<commit_message>
feat(reports): remove Suggestions section from weekly-report template
The 'Suggestions | Based on Current Data' heading, its description,
and the three Suggestion 1/2/3 placeholder tables are no longer in
the generated .docx. Report now flows: cover → Top performing →
(optional) Recently launched → Notes.
</commit_message>
<xml_diff>
--- a/src/templates/weekly-report.docx
+++ b/src/templates/weekly-report.docx
@@ -1338,367 +1338,6 @@
     <w:p>
       <w:r>
         <w:t xml:space="preserve">{/show_recent}</w:t>
-      </w:r>
-    </w:p>
-    <w:p>
-      <w:pPr>
-        <w:pBdr>
-          <w:bottom w:color="ed1c24" w:space="4" w:sz="6" w:val="single"/>
-        </w:pBdr>
-        <w:spacing w:after="120" w:before="360" w:lineRule="auto"/>
-        <w:rPr/>
-      </w:pPr>
-      <w:r>
-        <w:rPr>
-          <w:rFonts w:ascii="Arial" w:cs="Arial" w:eastAsia="Arial" w:hAnsi="Arial"/>
-          <w:b w:val="1"/>
-          <w:bCs w:val="1"/>
-          <w:color w:val="ed1c24"/>
-          <w:sz w:val="24"/>
-          <w:szCs w:val="24"/>
-          <w:rtl w:val="0"/>
-        </w:rPr>
-        <w:t xml:space="preserve">Suggestions  |  Based on Current Data</w:t>
-      </w:r>
-      <w:r>
-        <w:rPr>
-          <w:rtl w:val="0"/>
-        </w:rPr>
-      </w:r>
-    </w:p>
-    <w:p>
-      <w:pPr>
-        <w:spacing w:after="100" w:lineRule="auto"/>
-        <w:rPr/>
-      </w:pPr>
-      <w:r>
-        <w:rPr>
-          <w:rFonts w:ascii="Arial" w:cs="Arial" w:eastAsia="Arial" w:hAnsi="Arial"/>
-          <w:i w:val="1"/>
-          <w:iCs w:val="1"/>
-          <w:color w:val="666666"/>
-          <w:sz w:val="18"/>
-          <w:szCs w:val="18"/>
-          <w:rtl w:val="0"/>
-        </w:rPr>
-        <w:t xml:space="preserve">Actionable recommendations based on the data above.</w:t>
-      </w:r>
-      <w:r>
-        <w:rPr>
-          <w:rtl w:val="0"/>
-        </w:rPr>
-      </w:r>
-    </w:p>
-    <w:tbl>
-      <w:tblPr>
-        <w:tblStyle w:val="Table5"/>
-        <w:tblW w:w="9026.0" w:type="dxa"/>
-        <w:jc w:val="left"/>
-        <w:tblBorders>
-          <w:top w:color="000000" w:space="0" w:sz="4" w:val="single"/>
-          <w:left w:color="000000" w:space="0" w:sz="4" w:val="single"/>
-          <w:bottom w:color="000000" w:space="0" w:sz="4" w:val="single"/>
-          <w:right w:color="000000" w:space="0" w:sz="4" w:val="single"/>
-          <w:insideH w:color="000000" w:space="0" w:sz="4" w:val="single"/>
-          <w:insideV w:color="000000" w:space="0" w:sz="4" w:val="single"/>
-        </w:tblBorders>
-        <w:tblLayout w:type="fixed"/>
-        <w:tblLook w:val="0000"/>
-      </w:tblPr>
-      <w:tblGrid>
-        <w:gridCol w:w="9026"/>
-        <w:tblGridChange w:id="0">
-          <w:tblGrid>
-            <w:gridCol w:w="9026"/>
-          </w:tblGrid>
-        </w:tblGridChange>
-      </w:tblGrid>
-      <w:tr>
-        <w:trPr>
-          <w:cantSplit w:val="0"/>
-          <w:tblHeader w:val="0"/>
-        </w:trPr>
-        <w:tc>
-          <w:tcPr>
-            <w:tcBorders>
-              <w:top w:color="dddddd" w:space="0" w:sz="4" w:val="single"/>
-              <w:left w:color="ed1c24" w:space="0" w:sz="8" w:val="single"/>
-              <w:bottom w:color="dddddd" w:space="0" w:sz="4" w:val="single"/>
-              <w:right w:color="dddddd" w:space="0" w:sz="4" w:val="single"/>
-            </w:tcBorders>
-            <w:shd w:fill="fde8e9" w:val="clear"/>
-            <w:tcMar>
-              <w:top w:w="80.0" w:type="dxa"/>
-              <w:left w:w="160.0" w:type="dxa"/>
-              <w:bottom w:w="80.0" w:type="dxa"/>
-              <w:right w:w="120.0" w:type="dxa"/>
-            </w:tcMar>
-          </w:tcPr>
-          <w:p>
-            <w:pPr>
-              <w:spacing w:after="40" w:lineRule="auto"/>
-              <w:rPr/>
-            </w:pPr>
-            <w:r>
-              <w:rPr>
-                <w:rFonts w:ascii="Arial" w:cs="Arial" w:eastAsia="Arial" w:hAnsi="Arial"/>
-                <w:b w:val="1"/>
-                <w:bCs w:val="1"/>
-                <w:color w:val="c41019"/>
-                <w:sz w:val="20"/>
-                <w:szCs w:val="20"/>
-                <w:rtl w:val="0"/>
-              </w:rPr>
-              <w:t xml:space="preserve">Suggestion 1</w:t>
-            </w:r>
-            <w:r>
-              <w:rPr>
-                <w:rtl w:val="0"/>
-              </w:rPr>
-            </w:r>
-          </w:p>
-          <w:p>
-            <w:pPr>
-              <w:rPr/>
-            </w:pPr>
-            <w:r>
-              <w:rPr>
-                <w:rFonts w:ascii="Arial" w:cs="Arial" w:eastAsia="Arial" w:hAnsi="Arial"/>
-                <w:i w:val="1"/>
-                <w:iCs w:val="1"/>
-                <w:color w:val="999999"/>
-                <w:sz w:val="20"/>
-                <w:szCs w:val="20"/>
-                <w:rtl w:val="0"/>
-              </w:rPr>
-              <w:t xml:space="preserve">[Briefly describe the recommendation + rationale]</w:t>
-            </w:r>
-            <w:r>
-              <w:rPr>
-                <w:rtl w:val="0"/>
-              </w:rPr>
-            </w:r>
-          </w:p>
-        </w:tc>
-      </w:tr>
-    </w:tbl>
-    <w:p>
-      <w:pPr>
-        <w:spacing w:after="120" w:lineRule="auto"/>
-        <w:rPr/>
-      </w:pPr>
-      <w:r>
-        <w:rPr>
-          <w:rtl w:val="0"/>
-        </w:rPr>
-      </w:r>
-    </w:p>
-    <w:tbl>
-      <w:tblPr>
-        <w:tblStyle w:val="Table6"/>
-        <w:tblW w:w="9026.0" w:type="dxa"/>
-        <w:jc w:val="left"/>
-        <w:tblBorders>
-          <w:top w:color="000000" w:space="0" w:sz="4" w:val="single"/>
-          <w:left w:color="000000" w:space="0" w:sz="4" w:val="single"/>
-          <w:bottom w:color="000000" w:space="0" w:sz="4" w:val="single"/>
-          <w:right w:color="000000" w:space="0" w:sz="4" w:val="single"/>
-          <w:insideH w:color="000000" w:space="0" w:sz="4" w:val="single"/>
-          <w:insideV w:color="000000" w:space="0" w:sz="4" w:val="single"/>
-        </w:tblBorders>
-        <w:tblLayout w:type="fixed"/>
-        <w:tblLook w:val="0000"/>
-      </w:tblPr>
-      <w:tblGrid>
-        <w:gridCol w:w="9026"/>
-        <w:tblGridChange w:id="0">
-          <w:tblGrid>
-            <w:gridCol w:w="9026"/>
-          </w:tblGrid>
-        </w:tblGridChange>
-      </w:tblGrid>
-      <w:tr>
-        <w:trPr>
-          <w:cantSplit w:val="0"/>
-          <w:tblHeader w:val="0"/>
-        </w:trPr>
-        <w:tc>
-          <w:tcPr>
-            <w:tcBorders>
-              <w:top w:color="dddddd" w:space="0" w:sz="4" w:val="single"/>
-              <w:left w:color="ed1c24" w:space="0" w:sz="8" w:val="single"/>
-              <w:bottom w:color="dddddd" w:space="0" w:sz="4" w:val="single"/>
-              <w:right w:color="dddddd" w:space="0" w:sz="4" w:val="single"/>
-            </w:tcBorders>
-            <w:shd w:fill="fde8e9" w:val="clear"/>
-            <w:tcMar>
-              <w:top w:w="80.0" w:type="dxa"/>
-              <w:left w:w="160.0" w:type="dxa"/>
-              <w:bottom w:w="80.0" w:type="dxa"/>
-              <w:right w:w="120.0" w:type="dxa"/>
-            </w:tcMar>
-          </w:tcPr>
-          <w:p>
-            <w:pPr>
-              <w:spacing w:after="40" w:lineRule="auto"/>
-              <w:rPr/>
-            </w:pPr>
-            <w:r>
-              <w:rPr>
-                <w:rFonts w:ascii="Arial" w:cs="Arial" w:eastAsia="Arial" w:hAnsi="Arial"/>
-                <w:b w:val="1"/>
-                <w:bCs w:val="1"/>
-                <w:color w:val="c41019"/>
-                <w:sz w:val="20"/>
-                <w:szCs w:val="20"/>
-                <w:rtl w:val="0"/>
-              </w:rPr>
-              <w:t xml:space="preserve">Suggestion 2</w:t>
-            </w:r>
-            <w:r>
-              <w:rPr>
-                <w:rtl w:val="0"/>
-              </w:rPr>
-            </w:r>
-          </w:p>
-          <w:p>
-            <w:pPr>
-              <w:rPr/>
-            </w:pPr>
-            <w:r>
-              <w:rPr>
-                <w:rFonts w:ascii="Arial" w:cs="Arial" w:eastAsia="Arial" w:hAnsi="Arial"/>
-                <w:i w:val="1"/>
-                <w:iCs w:val="1"/>
-                <w:color w:val="999999"/>
-                <w:sz w:val="20"/>
-                <w:szCs w:val="20"/>
-                <w:rtl w:val="0"/>
-              </w:rPr>
-              <w:t xml:space="preserve">[Briefly describe the recommendation + rationale]</w:t>
-            </w:r>
-            <w:r>
-              <w:rPr>
-                <w:rtl w:val="0"/>
-              </w:rPr>
-            </w:r>
-          </w:p>
-        </w:tc>
-      </w:tr>
-    </w:tbl>
-    <w:p>
-      <w:pPr>
-        <w:spacing w:after="120" w:lineRule="auto"/>
-        <w:rPr/>
-      </w:pPr>
-      <w:r>
-        <w:rPr>
-          <w:rtl w:val="0"/>
-        </w:rPr>
-      </w:r>
-    </w:p>
-    <w:tbl>
-      <w:tblPr>
-        <w:tblStyle w:val="Table7"/>
-        <w:tblW w:w="9026.0" w:type="dxa"/>
-        <w:jc w:val="left"/>
-        <w:tblBorders>
-          <w:top w:color="000000" w:space="0" w:sz="4" w:val="single"/>
-          <w:left w:color="000000" w:space="0" w:sz="4" w:val="single"/>
-          <w:bottom w:color="000000" w:space="0" w:sz="4" w:val="single"/>
-          <w:right w:color="000000" w:space="0" w:sz="4" w:val="single"/>
-          <w:insideH w:color="000000" w:space="0" w:sz="4" w:val="single"/>
-          <w:insideV w:color="000000" w:space="0" w:sz="4" w:val="single"/>
-        </w:tblBorders>
-        <w:tblLayout w:type="fixed"/>
-        <w:tblLook w:val="0000"/>
-      </w:tblPr>
-      <w:tblGrid>
-        <w:gridCol w:w="9026"/>
-        <w:tblGridChange w:id="0">
-          <w:tblGrid>
-            <w:gridCol w:w="9026"/>
-          </w:tblGrid>
-        </w:tblGridChange>
-      </w:tblGrid>
-      <w:tr>
-        <w:trPr>
-          <w:cantSplit w:val="0"/>
-          <w:tblHeader w:val="0"/>
-        </w:trPr>
-        <w:tc>
-          <w:tcPr>
-            <w:tcBorders>
-              <w:top w:color="dddddd" w:space="0" w:sz="4" w:val="single"/>
-              <w:left w:color="ed1c24" w:space="0" w:sz="8" w:val="single"/>
-              <w:bottom w:color="dddddd" w:space="0" w:sz="4" w:val="single"/>
-              <w:right w:color="dddddd" w:space="0" w:sz="4" w:val="single"/>
-            </w:tcBorders>
-            <w:shd w:fill="fde8e9" w:val="clear"/>
-            <w:tcMar>
-              <w:top w:w="80.0" w:type="dxa"/>
-              <w:left w:w="160.0" w:type="dxa"/>
-              <w:bottom w:w="80.0" w:type="dxa"/>
-              <w:right w:w="120.0" w:type="dxa"/>
-            </w:tcMar>
-          </w:tcPr>
-          <w:p>
-            <w:pPr>
-              <w:spacing w:after="40" w:lineRule="auto"/>
-              <w:rPr/>
-            </w:pPr>
-            <w:r>
-              <w:rPr>
-                <w:rFonts w:ascii="Arial" w:cs="Arial" w:eastAsia="Arial" w:hAnsi="Arial"/>
-                <w:b w:val="1"/>
-                <w:bCs w:val="1"/>
-                <w:color w:val="c41019"/>
-                <w:sz w:val="20"/>
-                <w:szCs w:val="20"/>
-                <w:rtl w:val="0"/>
-              </w:rPr>
-              <w:t xml:space="preserve">Suggestion 3</w:t>
-            </w:r>
-            <w:r>
-              <w:rPr>
-                <w:rtl w:val="0"/>
-              </w:rPr>
-            </w:r>
-          </w:p>
-          <w:p>
-            <w:pPr>
-              <w:rPr/>
-            </w:pPr>
-            <w:r>
-              <w:rPr>
-                <w:rFonts w:ascii="Arial" w:cs="Arial" w:eastAsia="Arial" w:hAnsi="Arial"/>
-                <w:i w:val="1"/>
-                <w:iCs w:val="1"/>
-                <w:color w:val="999999"/>
-                <w:sz w:val="20"/>
-                <w:szCs w:val="20"/>
-                <w:rtl w:val="0"/>
-              </w:rPr>
-              <w:t xml:space="preserve">[Briefly describe the recommendation + rationale]</w:t>
-            </w:r>
-            <w:r>
-              <w:rPr>
-                <w:rtl w:val="0"/>
-              </w:rPr>
-            </w:r>
-          </w:p>
-        </w:tc>
-      </w:tr>
-    </w:tbl>
-    <w:p>
-      <w:pPr>
-        <w:spacing w:after="120" w:lineRule="auto"/>
-        <w:rPr/>
-      </w:pPr>
-      <w:r>
-        <w:rPr>
-          <w:rtl w:val="0"/>
-        </w:rPr>
       </w:r>
     </w:p>
     <w:sectPr>

</xml_diff>